<commit_message>
Update example report to V2 (remove Li Auto chapter)
</commit_message>
<xml_diff>
--- a/examples/具身智能行业深度研究报告.docx
+++ b/examples/具身智能行业深度研究报告.docx
@@ -45,10 +45,10 @@
     </w:p>
     <w:p>
       <w:pPr>
+        <w:spacing w:before="40" w:after="80"/>
         <w:pBdr>
           <w:bottom w:val="single" w:sz="12" w:color="2E75B6"/>
         </w:pBdr>
-        <w:spacing w:before="40" w:after="80"/>
       </w:pPr>
     </w:p>
     <w:tbl>
@@ -208,7 +208,7 @@
                 <w:color w:val="404040"/>
                 <w:sz w:val="20"/>
               </w:rPr>
-              <w:t>访谈观点来自晚点聊播客逐字稿（第148-155期）；行业数据来自雷峰网、36氪、投中网、艾媒咨询、IDC等公开来源；理想汽车数据来自公司财报及公开报道；标注"访谈"者为受访者原话或观点，标注"来源"者为第三方数据</w:t>
+              <w:t>访谈观点来自晚点聊播客逐字稿（第148-155期）；行业数据来自雷峰网、36氪、投中网、艾媒咨询、IDC等公开来源；标注"访谈"者为受访者原话或观点，标注"来源"者为第三方数据</w:t>
             </w:r>
           </w:p>
         </w:tc>
@@ -240,10 +240,10 @@
     </w:p>
     <w:p>
       <w:pPr>
+        <w:spacing w:before="40" w:after="80"/>
         <w:pBdr>
           <w:bottom w:val="single" w:sz="18" w:color="1F4E79"/>
         </w:pBdr>
-        <w:spacing w:before="40" w:after="80"/>
       </w:pPr>
     </w:p>
     <w:p>
@@ -523,10 +523,10 @@
     </w:p>
     <w:p>
       <w:pPr>
+        <w:spacing w:before="40" w:after="80"/>
         <w:pBdr>
           <w:bottom w:val="single" w:sz="18" w:color="1F4E79"/>
         </w:pBdr>
-        <w:spacing w:before="40" w:after="80"/>
       </w:pPr>
     </w:p>
     <w:p>
@@ -685,13 +685,13 @@
         <w:tc>
           <w:tcPr>
             <w:tcW w:type="dxa" w:w="9072"/>
+            <w:shd w:val="clear" w:color="auto" w:fill="EFF3F8"/>
             <w:tcBorders>
               <w:top w:val="none" w:sz="0" w:color="auto"/>
+              <w:right w:val="none" w:sz="0" w:color="auto"/>
+              <w:bottom w:val="none" w:sz="0" w:color="auto"/>
               <w:left w:val="single" w:sz="24" w:color="2E75B6"/>
-              <w:bottom w:val="none" w:sz="0" w:color="auto"/>
-              <w:right w:val="none" w:sz="0" w:color="auto"/>
             </w:tcBorders>
-            <w:shd w:val="clear" w:color="auto" w:fill="EFF3F8"/>
           </w:tcPr>
           <w:p>
             <w:pPr>
@@ -824,10 +824,10 @@
     </w:p>
     <w:p>
       <w:pPr>
+        <w:spacing w:before="40" w:after="80"/>
         <w:pBdr>
           <w:bottom w:val="single" w:sz="18" w:color="1F4E79"/>
         </w:pBdr>
-        <w:spacing w:before="40" w:after="80"/>
       </w:pPr>
     </w:p>
     <w:p>
@@ -882,13 +882,13 @@
         <w:tc>
           <w:tcPr>
             <w:tcW w:type="dxa" w:w="9072"/>
+            <w:shd w:val="clear" w:color="auto" w:fill="EFF3F8"/>
             <w:tcBorders>
               <w:top w:val="none" w:sz="0" w:color="auto"/>
+              <w:right w:val="none" w:sz="0" w:color="auto"/>
+              <w:bottom w:val="none" w:sz="0" w:color="auto"/>
               <w:left w:val="single" w:sz="24" w:color="1F4E79"/>
-              <w:bottom w:val="none" w:sz="0" w:color="auto"/>
-              <w:right w:val="none" w:sz="0" w:color="auto"/>
             </w:tcBorders>
-            <w:shd w:val="clear" w:color="auto" w:fill="EFF3F8"/>
           </w:tcPr>
           <w:p>
             <w:pPr>
@@ -1423,10 +1423,10 @@
     </w:p>
     <w:p>
       <w:pPr>
+        <w:spacing w:before="40" w:after="80"/>
         <w:pBdr>
           <w:bottom w:val="single" w:sz="18" w:color="1F4E79"/>
         </w:pBdr>
-        <w:spacing w:before="40" w:after="80"/>
       </w:pPr>
     </w:p>
     <w:p>
@@ -1587,13 +1587,13 @@
         <w:tc>
           <w:tcPr>
             <w:tcW w:type="dxa" w:w="9072"/>
+            <w:shd w:val="clear" w:color="auto" w:fill="EFF3F8"/>
             <w:tcBorders>
               <w:top w:val="none" w:sz="0" w:color="auto"/>
+              <w:right w:val="none" w:sz="0" w:color="auto"/>
+              <w:bottom w:val="none" w:sz="0" w:color="auto"/>
               <w:left w:val="single" w:sz="24" w:color="C00000"/>
-              <w:bottom w:val="none" w:sz="0" w:color="auto"/>
-              <w:right w:val="none" w:sz="0" w:color="auto"/>
             </w:tcBorders>
-            <w:shd w:val="clear" w:color="auto" w:fill="EFF3F8"/>
           </w:tcPr>
           <w:p>
             <w:pPr>
@@ -1667,13 +1667,13 @@
         <w:tc>
           <w:tcPr>
             <w:tcW w:type="dxa" w:w="9072"/>
+            <w:shd w:val="clear" w:color="auto" w:fill="EFF3F8"/>
             <w:tcBorders>
               <w:top w:val="none" w:sz="0" w:color="auto"/>
+              <w:right w:val="none" w:sz="0" w:color="auto"/>
+              <w:bottom w:val="none" w:sz="0" w:color="auto"/>
               <w:left w:val="single" w:sz="24" w:color="1F4E79"/>
-              <w:bottom w:val="none" w:sz="0" w:color="auto"/>
-              <w:right w:val="none" w:sz="0" w:color="auto"/>
             </w:tcBorders>
-            <w:shd w:val="clear" w:color="auto" w:fill="EFF3F8"/>
           </w:tcPr>
           <w:p>
             <w:pPr>
@@ -2036,13 +2036,13 @@
         <w:tc>
           <w:tcPr>
             <w:tcW w:type="dxa" w:w="9072"/>
+            <w:shd w:val="clear" w:color="auto" w:fill="EFF3F8"/>
             <w:tcBorders>
               <w:top w:val="none" w:sz="0" w:color="auto"/>
+              <w:right w:val="none" w:sz="0" w:color="auto"/>
+              <w:bottom w:val="none" w:sz="0" w:color="auto"/>
               <w:left w:val="single" w:sz="24" w:color="ED7D31"/>
-              <w:bottom w:val="none" w:sz="0" w:color="auto"/>
-              <w:right w:val="none" w:sz="0" w:color="auto"/>
             </w:tcBorders>
-            <w:shd w:val="clear" w:color="auto" w:fill="EFF3F8"/>
           </w:tcPr>
           <w:p>
             <w:pPr>
@@ -2116,13 +2116,13 @@
         <w:tc>
           <w:tcPr>
             <w:tcW w:type="dxa" w:w="9072"/>
+            <w:shd w:val="clear" w:color="auto" w:fill="EFF3F8"/>
             <w:tcBorders>
               <w:top w:val="none" w:sz="0" w:color="auto"/>
+              <w:right w:val="none" w:sz="0" w:color="auto"/>
+              <w:bottom w:val="none" w:sz="0" w:color="auto"/>
               <w:left w:val="single" w:sz="24" w:color="1F4E79"/>
-              <w:bottom w:val="none" w:sz="0" w:color="auto"/>
-              <w:right w:val="none" w:sz="0" w:color="auto"/>
             </w:tcBorders>
-            <w:shd w:val="clear" w:color="auto" w:fill="EFF3F8"/>
           </w:tcPr>
           <w:p>
             <w:pPr>
@@ -2201,10 +2201,10 @@
     </w:p>
     <w:p>
       <w:pPr>
+        <w:spacing w:before="40" w:after="80"/>
         <w:pBdr>
           <w:bottom w:val="single" w:sz="18" w:color="1F4E79"/>
         </w:pBdr>
-        <w:spacing w:before="40" w:after="80"/>
       </w:pPr>
     </w:p>
     <w:p>
@@ -3110,10 +3110,10 @@
     </w:p>
     <w:p>
       <w:pPr>
+        <w:spacing w:before="40" w:after="80"/>
         <w:pBdr>
           <w:bottom w:val="single" w:sz="18" w:color="1F4E79"/>
         </w:pBdr>
-        <w:spacing w:before="40" w:after="80"/>
       </w:pPr>
     </w:p>
     <w:p>
@@ -3156,13 +3156,13 @@
         <w:tc>
           <w:tcPr>
             <w:tcW w:type="dxa" w:w="9072"/>
+            <w:shd w:val="clear" w:color="auto" w:fill="EFF3F8"/>
             <w:tcBorders>
               <w:top w:val="none" w:sz="0" w:color="auto"/>
+              <w:right w:val="none" w:sz="0" w:color="auto"/>
+              <w:bottom w:val="none" w:sz="0" w:color="auto"/>
               <w:left w:val="single" w:sz="24" w:color="C00000"/>
-              <w:bottom w:val="none" w:sz="0" w:color="auto"/>
-              <w:right w:val="none" w:sz="0" w:color="auto"/>
             </w:tcBorders>
-            <w:shd w:val="clear" w:color="auto" w:fill="EFF3F8"/>
           </w:tcPr>
           <w:p>
             <w:pPr>
@@ -3432,566 +3432,15 @@
           <w:color w:val="1F4E79"/>
           <w:sz w:val="36"/>
         </w:rPr>
-        <w:t>六、对理想汽车的战略启示</w:t>
-      </w:r>
-    </w:p>
-    <w:p>
-      <w:pPr>
-        <w:pBdr>
-          <w:bottom w:val="single" w:sz="18" w:color="1F4E79"/>
-        </w:pBdr>
-        <w:spacing w:before="40" w:after="80"/>
-      </w:pPr>
-    </w:p>
-    <w:p>
-      <w:pPr>
-        <w:spacing w:before="40" w:after="80"/>
-      </w:pPr>
-      <w:r>
-        <w:rPr>
-          <w:color w:val="404040"/>
-          <w:sz w:val="22"/>
-        </w:rPr>
-        <w:t>理想汽车正处于一个特殊的战略窗口期。李想在2026年财报季明确表示："2026年是理想进化为具身智能企业的关键一年。"公司已成立"空间机器人"和"穿戴机器人"两个新部门，发布MindVLA（视觉-语言-行为大模型），并宣布人形机器人"概率上100%会做，但节奏不是现在"。（来源：财报、澎湃新闻、新浪科技）</w:t>
-      </w:r>
-    </w:p>
-    <w:p>
-      <w:pPr>
-        <w:spacing w:before="80"/>
-        <w:jc w:val="center"/>
-      </w:pPr>
-      <w:r>
-        <w:drawing>
-          <wp:inline xmlns:a="http://schemas.openxmlformats.org/drawingml/2006/main" xmlns:pic="http://schemas.openxmlformats.org/drawingml/2006/picture">
-            <wp:extent cx="4572000" cy="3897497"/>
-            <wp:docPr id="6" name="Picture 6"/>
-            <wp:cNvGraphicFramePr>
-              <a:graphicFrameLocks noChangeAspect="1"/>
-            </wp:cNvGraphicFramePr>
-            <a:graphic>
-              <a:graphicData uri="http://schemas.openxmlformats.org/drawingml/2006/picture">
-                <pic:pic>
-                  <pic:nvPicPr>
-                    <pic:cNvPr id="0" name="chart6_lixiang_radar.png"/>
-                    <pic:cNvPicPr/>
-                  </pic:nvPicPr>
-                  <pic:blipFill>
-                    <a:blip r:embed="rId14"/>
-                    <a:stretch>
-                      <a:fillRect/>
-                    </a:stretch>
-                  </pic:blipFill>
-                  <pic:spPr>
-                    <a:xfrm>
-                      <a:off x="0" y="0"/>
-                      <a:ext cx="4572000" cy="3897497"/>
-                    </a:xfrm>
-                    <a:prstGeom prst="rect"/>
-                  </pic:spPr>
-                </pic:pic>
-              </a:graphicData>
-            </a:graphic>
-          </wp:inline>
-        </w:drawing>
-      </w:r>
-    </w:p>
-    <w:p>
-      <w:pPr>
-        <w:spacing w:after="200"/>
-        <w:jc w:val="center"/>
-      </w:pPr>
-      <w:r>
-        <w:rPr>
-          <w:i/>
-          <w:color w:val="808080"/>
-          <w:sz w:val="18"/>
-        </w:rPr>
-        <w:t>图6：理想汽车 vs 具身智能创业公司能力结构对比｜来源：公开财报与报道 + 访谈综合推断，数值为定性打分，不代表精确量化</w:t>
-      </w:r>
-    </w:p>
-    <w:p>
-      <w:pPr>
-        <w:keepNext/>
-        <w:spacing w:before="240" w:after="80"/>
-      </w:pPr>
-      <w:r>
-        <w:rPr>
-          <w:b/>
-          <w:color w:val="1F4E79"/>
-          <w:sz w:val="28"/>
-        </w:rPr>
-        <w:t>6.1  理想的独特优势：被低估的"数据先发优势"</w:t>
+        <w:t>结语：2026年，观测什么信号</w:t>
       </w:r>
     </w:p>
     <w:p>
       <w:pPr>
         <w:spacing w:before="40" w:after="80"/>
-      </w:pPr>
-      <w:r>
-        <w:rPr>
-          <w:color w:val="404040"/>
-          <w:sz w:val="22"/>
-        </w:rPr>
-        <w:t>对照本报告的三道关卡框架，理想在关卡一（数据）上有一个被严重低估的优势：</w:t>
-      </w:r>
-    </w:p>
-    <w:p>
-      <w:pPr>
-        <w:spacing w:before="40" w:after="80"/>
-      </w:pPr>
-      <w:r>
-        <w:rPr>
-          <w:color w:val="404040"/>
-          <w:sz w:val="22"/>
-        </w:rPr>
-        <w:t>理想是中国少数几个把汽车定义为"具身智能产品"的车企——车辆自身就是一个永远在部署的数据采集终端。MindGPT已积累10万亿Token预训练数据，包含自动驾驶场景中特有的多模态数据，覆盖感知-决策-执行的完整链路。（来源：公开报道）</w:t>
-      </w:r>
-    </w:p>
-    <w:p>
-      <w:pPr>
-        <w:spacing w:before="40" w:after="80"/>
-      </w:pPr>
-      <w:r>
-        <w:rPr>
-          <w:color w:val="404040"/>
-          <w:sz w:val="22"/>
-        </w:rPr>
-        <w:t>贾鹏（前理想）的自动驾驶经验印证了这一点：特斯拉在2016年就已预埋FSD芯片、强制标配传感器，为的是提前收集用户数据。理想在一定程度上走了同样的路——但在机器人侧的数据闭环尚未建立。</w:t>
-      </w:r>
-    </w:p>
-    <w:tbl>
-      <w:tblPr>
-        <w:tblStyle w:val="TableGrid"/>
-        <w:tblW w:type="auto" w:w="0"/>
-        <w:jc w:val="center"/>
-        <w:tblLook w:firstColumn="1" w:firstRow="1" w:lastColumn="0" w:lastRow="0" w:noHBand="0" w:noVBand="1" w:val="04A0"/>
-      </w:tblPr>
-      <w:tblGrid>
-        <w:gridCol w:w="9072"/>
-      </w:tblGrid>
-      <w:tr>
-        <w:tc>
-          <w:tcPr>
-            <w:tcW w:type="dxa" w:w="9072"/>
-            <w:tcBorders>
-              <w:top w:val="none" w:sz="0" w:color="auto"/>
-              <w:left w:val="single" w:sz="24" w:color="1F4E79"/>
-              <w:bottom w:val="none" w:sz="0" w:color="auto"/>
-              <w:right w:val="none" w:sz="0" w:color="auto"/>
-            </w:tcBorders>
-            <w:shd w:val="clear" w:color="auto" w:fill="EFF3F8"/>
-          </w:tcPr>
-          <w:p>
-            <w:pPr>
-              <w:spacing w:before="120" w:after="40"/>
-              <w:ind w:left="227" w:right="227"/>
-            </w:pPr>
-            <w:r>
-              <w:rPr>
-                <w:i/>
-                <w:color w:val="1F4E79"/>
-                <w:sz w:val="22"/>
-              </w:rPr>
-              <w:t>“Elon Musk的思考是：你最后最后还是要归结到数据驱动这件事来。我愿意为这个去提前预埋硬件，我可以提前去收集数据。”</w:t>
-            </w:r>
-          </w:p>
-          <w:p>
-            <w:pPr>
-              <w:spacing w:after="120"/>
-              <w:ind w:left="227"/>
-            </w:pPr>
-            <w:r>
-              <w:rPr>
-                <w:b/>
-                <w:color w:val="2E75B6"/>
-                <w:sz w:val="19"/>
-              </w:rPr>
-              <w:t>— 贾鹏（前理想汽车），回忆Elon Musk战略逻辑（访谈）</w:t>
-            </w:r>
-          </w:p>
-        </w:tc>
-      </w:tr>
-    </w:tbl>
-    <w:p/>
-    <w:p>
-      <w:pPr>
-        <w:keepNext/>
-        <w:spacing w:before="240" w:after="80"/>
-      </w:pPr>
-      <w:r>
-        <w:rPr>
-          <w:b/>
-          <w:color w:val="1F4E79"/>
-          <w:sz w:val="28"/>
-        </w:rPr>
-        <w:t>6.2  理想的战略建议</w:t>
-      </w:r>
-    </w:p>
-    <w:tbl>
-      <w:tblPr>
-        <w:tblStyle w:val="TableGrid"/>
-        <w:tblW w:type="auto" w:w="0"/>
-        <w:jc w:val="left"/>
-        <w:tblLook w:firstColumn="1" w:firstRow="1" w:lastColumn="0" w:lastRow="0" w:noHBand="0" w:noVBand="1" w:val="04A0"/>
-      </w:tblPr>
-      <w:tblGrid>
-        <w:gridCol w:w="4536"/>
-        <w:gridCol w:w="4536"/>
-      </w:tblGrid>
-      <w:tr>
-        <w:tc>
-          <w:tcPr>
-            <w:tcW w:type="dxa" w:w="9072"/>
-            <w:gridSpan w:val="2"/>
-            <w:shd w:val="clear" w:color="auto" w:fill="1F4E79"/>
-          </w:tcPr>
-          <w:p>
-            <w:pPr>
-              <w:spacing w:before="100" w:after="100"/>
-              <w:ind w:left="170"/>
-            </w:pPr>
-            <w:r>
-              <w:rPr>
-                <w:b/>
-                <w:color w:val="FFFFFF"/>
-                <w:sz w:val="22"/>
-              </w:rPr>
-              <w:t>优先级 ①  将"感知-决策-执行"架构明确延伸到机器人业务</w:t>
-            </w:r>
-          </w:p>
-        </w:tc>
-      </w:tr>
-      <w:tr>
-        <w:tc>
-          <w:tcPr>
-            <w:tcW w:type="dxa" w:w="9072"/>
-            <w:gridSpan w:val="2"/>
-            <w:shd w:val="clear" w:color="auto" w:fill="FAFAFA"/>
-          </w:tcPr>
-          <w:p>
-            <w:pPr>
-              <w:spacing w:before="100" w:after="100"/>
-              <w:ind w:left="170" w:right="170"/>
-            </w:pPr>
-            <w:r>
-              <w:rPr>
-                <w:color w:val="404040"/>
-                <w:sz w:val="21"/>
-              </w:rPr>
-              <w:t>汽车与机器人在核心架构上高度同源（陈亦伦语）。理想MindVLA的空间理解能力、行为规划能力，是从汽车迁移到机器人本体的最短路径。建议将MindVLA定位为"具身基础模型"，而非单纯的自动驾驶模型。</w:t>
-            </w:r>
-          </w:p>
-        </w:tc>
-      </w:tr>
-      <w:tr>
-        <w:tc>
-          <w:tcPr>
-            <w:tcW w:type="dxa" w:w="9072"/>
-            <w:gridSpan w:val="2"/>
-            <w:shd w:val="clear" w:color="auto" w:fill="EFF3F8"/>
-          </w:tcPr>
-          <w:p>
-            <w:pPr>
-              <w:spacing w:before="60" w:after="60"/>
-              <w:ind w:left="170"/>
-            </w:pPr>
-            <w:r>
-              <w:rPr>
-                <w:i/>
-                <w:color w:val="2E75B6"/>
-                <w:sz w:val="19"/>
-              </w:rPr>
-              <w:t>启示来源：陈亦伦（踏石）访谈，理想MindVLA公开报道</w:t>
-            </w:r>
-          </w:p>
-        </w:tc>
-      </w:tr>
-    </w:tbl>
-    <w:p>
-      <w:pPr>
-        <w:spacing w:after="80"/>
-      </w:pPr>
-    </w:p>
-    <w:tbl>
-      <w:tblPr>
-        <w:tblStyle w:val="TableGrid"/>
-        <w:tblW w:type="auto" w:w="0"/>
-        <w:jc w:val="left"/>
-        <w:tblLook w:firstColumn="1" w:firstRow="1" w:lastColumn="0" w:lastRow="0" w:noHBand="0" w:noVBand="1" w:val="04A0"/>
-      </w:tblPr>
-      <w:tblGrid>
-        <w:gridCol w:w="4536"/>
-        <w:gridCol w:w="4536"/>
-      </w:tblGrid>
-      <w:tr>
-        <w:tc>
-          <w:tcPr>
-            <w:tcW w:type="dxa" w:w="9072"/>
-            <w:gridSpan w:val="2"/>
-            <w:shd w:val="clear" w:color="auto" w:fill="ED7D31"/>
-          </w:tcPr>
-          <w:p>
-            <w:pPr>
-              <w:spacing w:before="100" w:after="100"/>
-              <w:ind w:left="170"/>
-            </w:pPr>
-            <w:r>
-              <w:rPr>
-                <w:b/>
-                <w:color w:val="FFFFFF"/>
-                <w:sz w:val="22"/>
-              </w:rPr>
-              <w:t>优先级 ②  选择"可数据化"的场景作为机器人第一落地点</w:t>
-            </w:r>
-          </w:p>
-        </w:tc>
-      </w:tr>
-      <w:tr>
-        <w:tc>
-          <w:tcPr>
-            <w:tcW w:type="dxa" w:w="9072"/>
-            <w:gridSpan w:val="2"/>
-            <w:shd w:val="clear" w:color="auto" w:fill="FAFAFA"/>
-          </w:tcPr>
-          <w:p>
-            <w:pPr>
-              <w:spacing w:before="100" w:after="100"/>
-              <w:ind w:left="170" w:right="170"/>
-            </w:pPr>
-            <w:r>
-              <w:rPr>
-                <w:color w:val="404040"/>
-                <w:sz w:val="21"/>
-              </w:rPr>
-              <w:t>韩峰涛的宁德时代经验揭示：选对场景比模型能力更重要。建议理想优先考虑其制造工厂内部的标准化操作场景——一方面节拍可控、容错率相对高，另一方面能积累专有工厂数据，构建竞争对手难以复制的数据壁垒。贾鹏在理想工厂的工作经历提示这类场景的具体要求。</w:t>
-            </w:r>
-          </w:p>
-        </w:tc>
-      </w:tr>
-      <w:tr>
-        <w:tc>
-          <w:tcPr>
-            <w:tcW w:type="dxa" w:w="9072"/>
-            <w:gridSpan w:val="2"/>
-            <w:shd w:val="clear" w:color="auto" w:fill="EFF3F8"/>
-          </w:tcPr>
-          <w:p>
-            <w:pPr>
-              <w:spacing w:before="60" w:after="60"/>
-              <w:ind w:left="170"/>
-            </w:pPr>
-            <w:r>
-              <w:rPr>
-                <w:i/>
-                <w:color w:val="2E75B6"/>
-                <w:sz w:val="19"/>
-              </w:rPr>
-              <w:t>启示来源：韩峰涛（千寻）访谈，贾鹏（至简）访谈</w:t>
-            </w:r>
-          </w:p>
-        </w:tc>
-      </w:tr>
-    </w:tbl>
-    <w:p>
-      <w:pPr>
-        <w:spacing w:after="80"/>
-      </w:pPr>
-    </w:p>
-    <w:tbl>
-      <w:tblPr>
-        <w:tblStyle w:val="TableGrid"/>
-        <w:tblW w:type="auto" w:w="0"/>
-        <w:jc w:val="left"/>
-        <w:tblLook w:firstColumn="1" w:firstRow="1" w:lastColumn="0" w:lastRow="0" w:noHBand="0" w:noVBand="1" w:val="04A0"/>
-      </w:tblPr>
-      <w:tblGrid>
-        <w:gridCol w:w="4536"/>
-        <w:gridCol w:w="4536"/>
-      </w:tblGrid>
-      <w:tr>
-        <w:tc>
-          <w:tcPr>
-            <w:tcW w:type="dxa" w:w="9072"/>
-            <w:gridSpan w:val="2"/>
-            <w:shd w:val="clear" w:color="auto" w:fill="375623"/>
-          </w:tcPr>
-          <w:p>
-            <w:pPr>
-              <w:spacing w:before="100" w:after="100"/>
-              <w:ind w:left="170"/>
-            </w:pPr>
-            <w:r>
-              <w:rPr>
-                <w:b/>
-                <w:color w:val="FFFFFF"/>
-                <w:sz w:val="22"/>
-              </w:rPr>
-              <w:t>优先级 ③  硬件策略：与供应链深度合作而非全自研</w:t>
-            </w:r>
-          </w:p>
-        </w:tc>
-      </w:tr>
-      <w:tr>
-        <w:tc>
-          <w:tcPr>
-            <w:tcW w:type="dxa" w:w="9072"/>
-            <w:gridSpan w:val="2"/>
-            <w:shd w:val="clear" w:color="auto" w:fill="FAFAFA"/>
-          </w:tcPr>
-          <w:p>
-            <w:pPr>
-              <w:spacing w:before="100" w:after="100"/>
-              <w:ind w:left="170" w:right="170"/>
-            </w:pPr>
-            <w:r>
-              <w:rPr>
-                <w:color w:val="404040"/>
-                <w:sz w:val="21"/>
-              </w:rPr>
-              <w:t>贾鹏的"六边形战士"策略对大公司不一定适用。理想更好的模式可能是：把核心投入放在大脑（MindVLA + 数据闭环），硬件本体与零部件通过战略合作或直接投资供应链伙伴获得——参考特斯拉模式（强调芯片和算力，与Tier 1深度绑定）。</w:t>
-            </w:r>
-          </w:p>
-        </w:tc>
-      </w:tr>
-      <w:tr>
-        <w:tc>
-          <w:tcPr>
-            <w:tcW w:type="dxa" w:w="9072"/>
-            <w:gridSpan w:val="2"/>
-            <w:shd w:val="clear" w:color="auto" w:fill="EFF3F8"/>
-          </w:tcPr>
-          <w:p>
-            <w:pPr>
-              <w:spacing w:before="60" w:after="60"/>
-              <w:ind w:left="170"/>
-            </w:pPr>
-            <w:r>
-              <w:rPr>
-                <w:i/>
-                <w:color w:val="2E75B6"/>
-                <w:sz w:val="19"/>
-              </w:rPr>
-              <w:t>启示来源：贾鹏（至简）访谈，陈亦伦（踏石）访谈</w:t>
-            </w:r>
-          </w:p>
-        </w:tc>
-      </w:tr>
-    </w:tbl>
-    <w:p>
-      <w:pPr>
-        <w:spacing w:after="80"/>
-      </w:pPr>
-    </w:p>
-    <w:tbl>
-      <w:tblPr>
-        <w:tblStyle w:val="TableGrid"/>
-        <w:tblW w:type="auto" w:w="0"/>
-        <w:jc w:val="left"/>
-        <w:tblLook w:firstColumn="1" w:firstRow="1" w:lastColumn="0" w:lastRow="0" w:noHBand="0" w:noVBand="1" w:val="04A0"/>
-      </w:tblPr>
-      <w:tblGrid>
-        <w:gridCol w:w="4536"/>
-        <w:gridCol w:w="4536"/>
-      </w:tblGrid>
-      <w:tr>
-        <w:tc>
-          <w:tcPr>
-            <w:tcW w:type="dxa" w:w="9072"/>
-            <w:gridSpan w:val="2"/>
-            <w:shd w:val="clear" w:color="auto" w:fill="C00000"/>
-          </w:tcPr>
-          <w:p>
-            <w:pPr>
-              <w:spacing w:before="100" w:after="100"/>
-              <w:ind w:left="170"/>
-            </w:pPr>
-            <w:r>
-              <w:rPr>
-                <w:b/>
-                <w:color w:val="FFFFFF"/>
-                <w:sz w:val="22"/>
-              </w:rPr>
-              <w:t>优先级 ④  警惕"26年落地生死年"的叙事陷阱</w:t>
-            </w:r>
-          </w:p>
-        </w:tc>
-      </w:tr>
-      <w:tr>
-        <w:tc>
-          <w:tcPr>
-            <w:tcW w:type="dxa" w:w="9072"/>
-            <w:gridSpan w:val="2"/>
-            <w:shd w:val="clear" w:color="auto" w:fill="FAFAFA"/>
-          </w:tcPr>
-          <w:p>
-            <w:pPr>
-              <w:spacing w:before="100" w:after="100"/>
-              <w:ind w:left="170" w:right="170"/>
-            </w:pPr>
-            <w:r>
-              <w:rPr>
-                <w:color w:val="404040"/>
-                <w:sz w:val="21"/>
-              </w:rPr>
-              <w:t>行业内外存在一种压力：2026年如果没有规模化落地，就是"失败"。韩峰涛明确反对这一叙事，认为26年是模型能力爆发年，不是落地生死年。理想应以模型能力迭代速度作为主要KPI，而非商业化营收，避免因短期落地压力导致技术路线扭曲。</w:t>
-            </w:r>
-          </w:p>
-        </w:tc>
-      </w:tr>
-      <w:tr>
-        <w:tc>
-          <w:tcPr>
-            <w:tcW w:type="dxa" w:w="9072"/>
-            <w:gridSpan w:val="2"/>
-            <w:shd w:val="clear" w:color="auto" w:fill="EFF3F8"/>
-          </w:tcPr>
-          <w:p>
-            <w:pPr>
-              <w:spacing w:before="60" w:after="60"/>
-              <w:ind w:left="170"/>
-            </w:pPr>
-            <w:r>
-              <w:rPr>
-                <w:i/>
-                <w:color w:val="2E75B6"/>
-                <w:sz w:val="19"/>
-              </w:rPr>
-              <w:t>启示来源：韩峰涛（千寻）访谈</w:t>
-            </w:r>
-          </w:p>
-        </w:tc>
-      </w:tr>
-    </w:tbl>
-    <w:p>
-      <w:pPr>
-        <w:spacing w:after="80"/>
-      </w:pPr>
-    </w:p>
-    <w:p>
-      <w:r>
-        <w:br w:type="page"/>
-      </w:r>
-    </w:p>
-    <w:p>
-      <w:pPr>
-        <w:keepNext/>
-        <w:spacing w:before="320" w:after="120"/>
-      </w:pPr>
-      <w:r>
-        <w:rPr>
-          <w:b/>
-          <w:color w:val="1F4E79"/>
-          <w:sz w:val="36"/>
-        </w:rPr>
-        <w:t>结语：2026年，观测什么信号</w:t>
-      </w:r>
-    </w:p>
-    <w:p>
-      <w:pPr>
         <w:pBdr>
           <w:bottom w:val="single" w:sz="18" w:color="1F4E79"/>
         </w:pBdr>
-        <w:spacing w:before="40" w:after="80"/>
       </w:pPr>
     </w:p>
     <w:p>
@@ -4189,13 +3638,13 @@
         <w:tc>
           <w:tcPr>
             <w:tcW w:type="dxa" w:w="9072"/>
+            <w:shd w:val="clear" w:color="auto" w:fill="EFF3F8"/>
             <w:tcBorders>
               <w:top w:val="none" w:sz="0" w:color="auto"/>
+              <w:right w:val="none" w:sz="0" w:color="auto"/>
+              <w:bottom w:val="none" w:sz="0" w:color="auto"/>
               <w:left w:val="single" w:sz="24" w:color="2E75B6"/>
-              <w:bottom w:val="none" w:sz="0" w:color="auto"/>
-              <w:right w:val="none" w:sz="0" w:color="auto"/>
             </w:tcBorders>
-            <w:shd w:val="clear" w:color="auto" w:fill="EFF3F8"/>
           </w:tcPr>
           <w:p>
             <w:pPr>
@@ -4262,10 +3711,10 @@
     </w:p>
     <w:p>
       <w:pPr>
+        <w:spacing w:before="40" w:after="80"/>
         <w:pBdr>
           <w:bottom w:val="single" w:sz="18" w:color="1F4E79"/>
         </w:pBdr>
-        <w:spacing w:before="40" w:after="80"/>
       </w:pPr>
     </w:p>
     <w:p>
@@ -4628,35 +4077,7 @@
           <w:color w:val="404040"/>
           <w:sz w:val="20"/>
         </w:rPr>
-        <w:t>理想汽车2025年度财报及投资者关系材料</w:t>
-      </w:r>
-    </w:p>
-    <w:p>
-      <w:pPr>
-        <w:pStyle w:val="ListBullet"/>
-        <w:spacing w:before="20" w:after="20"/>
-        <w:ind w:left="454"/>
-      </w:pPr>
-      <w:r>
-        <w:rPr>
-          <w:color w:val="404040"/>
-          <w:sz w:val="20"/>
-        </w:rPr>
         <w:t>The Robot Report：China experiences physical AI surge（therobotreport.com）</w:t>
-      </w:r>
-    </w:p>
-    <w:p>
-      <w:pPr>
-        <w:pStyle w:val="ListBullet"/>
-        <w:spacing w:before="20" w:after="20"/>
-        <w:ind w:left="454"/>
-      </w:pPr>
-      <w:r>
-        <w:rPr>
-          <w:color w:val="404040"/>
-          <w:sz w:val="20"/>
-        </w:rPr>
-        <w:t>澎湃新闻、新浪科技、量子位等：理想汽车机器人战略相关报道</w:t>
       </w:r>
     </w:p>
     <w:p>

</xml_diff>